<commit_message>
fejlesztoi doksihoz oldalszam hozzaadva
</commit_message>
<xml_diff>
--- a/Fejlesztői és tesztelési dokumentáció.docx
+++ b/Fejlesztői és tesztelési dokumentáció.docx
@@ -38,7 +38,7 @@
                     </pic:cNvPicPr>
                   </pic:nvPicPr>
                   <pic:blipFill>
-                    <a:blip r:embed="rId5" cstate="print">
+                    <a:blip r:embed="rId7" cstate="print">
                       <a:extLst>
                         <a:ext uri="{28A0092B-C50C-407E-A947-70E740481C1C}">
                           <a14:useLocalDpi xmlns:a14="http://schemas.microsoft.com/office/drawing/2010/main" val="0"/>
@@ -164,7 +164,7 @@
                     <pic:cNvPicPr/>
                   </pic:nvPicPr>
                   <pic:blipFill>
-                    <a:blip r:embed="rId6"/>
+                    <a:blip r:embed="rId8"/>
                     <a:stretch>
                       <a:fillRect/>
                     </a:stretch>
@@ -23796,6 +23796,7 @@
         <w:rPr>
           <w:b/>
           <w:bCs/>
+          <w:noProof/>
           <w:color w:val="4472C4" w:themeColor="accent1"/>
           <w:sz w:val="26"/>
           <w:szCs w:val="26"/>
@@ -23816,7 +23817,7 @@
                     <pic:cNvPicPr/>
                   </pic:nvPicPr>
                   <pic:blipFill>
-                    <a:blip r:embed="rId7">
+                    <a:blip r:embed="rId9">
                       <a:extLst>
                         <a:ext uri="{28A0092B-C50C-407E-A947-70E740481C1C}">
                           <a14:useLocalDpi xmlns:a14="http://schemas.microsoft.com/office/drawing/2010/main" val="0"/>
@@ -24063,6 +24064,7 @@
         <w:rPr>
           <w:b/>
           <w:bCs/>
+          <w:noProof/>
           <w:color w:val="4472C4" w:themeColor="accent1"/>
           <w:sz w:val="26"/>
           <w:szCs w:val="26"/>
@@ -24100,7 +24102,7 @@
                     <pic:cNvPicPr/>
                   </pic:nvPicPr>
                   <pic:blipFill>
-                    <a:blip r:embed="rId8">
+                    <a:blip r:embed="rId10">
                       <a:extLst>
                         <a:ext uri="{28A0092B-C50C-407E-A947-70E740481C1C}">
                           <a14:useLocalDpi xmlns:a14="http://schemas.microsoft.com/office/drawing/2010/main" val="0"/>
@@ -24565,6 +24567,7 @@
       </w:pPr>
       <w:r>
         <w:rPr>
+          <w:noProof/>
           <w:color w:val="000000" w:themeColor="text1"/>
           <w:sz w:val="24"/>
           <w:szCs w:val="24"/>
@@ -24585,7 +24588,7 @@
                     <pic:cNvPicPr/>
                   </pic:nvPicPr>
                   <pic:blipFill>
-                    <a:blip r:embed="rId9"/>
+                    <a:blip r:embed="rId11"/>
                     <a:stretch>
                       <a:fillRect/>
                     </a:stretch>
@@ -24849,6 +24852,7 @@
       </w:pPr>
       <w:r>
         <w:rPr>
+          <w:noProof/>
           <w:color w:val="000000" w:themeColor="text1"/>
           <w:sz w:val="24"/>
           <w:szCs w:val="24"/>
@@ -24869,7 +24873,7 @@
                     <pic:cNvPicPr/>
                   </pic:nvPicPr>
                   <pic:blipFill>
-                    <a:blip r:embed="rId10"/>
+                    <a:blip r:embed="rId12"/>
                     <a:stretch>
                       <a:fillRect/>
                     </a:stretch>
@@ -25117,6 +25121,7 @@
       </w:pPr>
       <w:r>
         <w:rPr>
+          <w:noProof/>
           <w:color w:val="000000" w:themeColor="text1"/>
           <w:sz w:val="24"/>
           <w:szCs w:val="24"/>
@@ -25137,7 +25142,7 @@
                     <pic:cNvPicPr/>
                   </pic:nvPicPr>
                   <pic:blipFill>
-                    <a:blip r:embed="rId11"/>
+                    <a:blip r:embed="rId13"/>
                     <a:stretch>
                       <a:fillRect/>
                     </a:stretch>
@@ -25404,6 +25409,7 @@
       </w:pPr>
       <w:r>
         <w:rPr>
+          <w:noProof/>
           <w:color w:val="000000" w:themeColor="text1"/>
           <w:sz w:val="24"/>
           <w:szCs w:val="24"/>
@@ -25424,7 +25430,7 @@
                     <pic:cNvPicPr/>
                   </pic:nvPicPr>
                   <pic:blipFill>
-                    <a:blip r:embed="rId12"/>
+                    <a:blip r:embed="rId14"/>
                     <a:stretch>
                       <a:fillRect/>
                     </a:stretch>
@@ -25703,6 +25709,7 @@
       </w:pPr>
       <w:r>
         <w:rPr>
+          <w:noProof/>
           <w:color w:val="000000" w:themeColor="text1"/>
           <w:sz w:val="24"/>
           <w:szCs w:val="24"/>
@@ -25723,7 +25730,7 @@
                     <pic:cNvPicPr/>
                   </pic:nvPicPr>
                   <pic:blipFill>
-                    <a:blip r:embed="rId13"/>
+                    <a:blip r:embed="rId15"/>
                     <a:stretch>
                       <a:fillRect/>
                     </a:stretch>
@@ -26084,6 +26091,7 @@
       </w:pPr>
       <w:r>
         <w:rPr>
+          <w:noProof/>
           <w:color w:val="000000" w:themeColor="text1"/>
           <w:sz w:val="24"/>
           <w:szCs w:val="24"/>
@@ -26104,7 +26112,7 @@
                     <pic:cNvPicPr/>
                   </pic:nvPicPr>
                   <pic:blipFill>
-                    <a:blip r:embed="rId14"/>
+                    <a:blip r:embed="rId16"/>
                     <a:stretch>
                       <a:fillRect/>
                     </a:stretch>
@@ -26351,6 +26359,7 @@
       </w:pPr>
       <w:r>
         <w:rPr>
+          <w:noProof/>
           <w:color w:val="000000" w:themeColor="text1"/>
           <w:sz w:val="24"/>
           <w:szCs w:val="24"/>
@@ -26371,7 +26380,7 @@
                     <pic:cNvPicPr/>
                   </pic:nvPicPr>
                   <pic:blipFill>
-                    <a:blip r:embed="rId15"/>
+                    <a:blip r:embed="rId17"/>
                     <a:stretch>
                       <a:fillRect/>
                     </a:stretch>
@@ -26634,6 +26643,7 @@
       </w:pPr>
       <w:r>
         <w:rPr>
+          <w:noProof/>
           <w:color w:val="000000" w:themeColor="text1"/>
           <w:sz w:val="24"/>
           <w:szCs w:val="24"/>
@@ -26654,7 +26664,7 @@
                     <pic:cNvPicPr/>
                   </pic:nvPicPr>
                   <pic:blipFill>
-                    <a:blip r:embed="rId16"/>
+                    <a:blip r:embed="rId18"/>
                     <a:stretch>
                       <a:fillRect/>
                     </a:stretch>
@@ -26789,6 +26799,7 @@
       </w:r>
     </w:p>
     <w:sectPr>
+      <w:footerReference w:type="default" r:id="rId19"/>
       <w:pgSz w:w="11906" w:h="16838"/>
       <w:pgMar w:top="1440" w:right="1440" w:bottom="1440" w:left="1701" w:header="708" w:footer="708" w:gutter="0"/>
       <w:cols w:space="708"/>
@@ -26796,6 +26807,86 @@
     </w:sectPr>
   </w:body>
 </w:document>
+</file>
+
+<file path=word/endnotes.xml><?xml version="1.0" encoding="utf-8"?>
+<w:endnotes xmlns:wpc="http://schemas.microsoft.com/office/word/2010/wordprocessingCanvas" xmlns:cx="http://schemas.microsoft.com/office/drawing/2014/chartex" xmlns:cx1="http://schemas.microsoft.com/office/drawing/2015/9/8/chartex" xmlns:cx2="http://schemas.microsoft.com/office/drawing/2015/10/21/chartex" xmlns:cx3="http://schemas.microsoft.com/office/drawing/2016/5/9/chartex" xmlns:cx4="http://schemas.microsoft.com/office/drawing/2016/5/10/chartex" xmlns:cx5="http://schemas.microsoft.com/office/drawing/2016/5/11/chartex" xmlns:cx6="http://schemas.microsoft.com/office/drawing/2016/5/12/chartex" xmlns:cx7="http://schemas.microsoft.com/office/drawing/2016/5/13/chartex" xmlns:cx8="http://schemas.microsoft.com/office/drawing/2016/5/14/chartex" xmlns:mc="http://schemas.openxmlformats.org/markup-compatibility/2006" xmlns:aink="http://schemas.microsoft.com/office/drawing/2016/ink" xmlns:am3d="http://schemas.microsoft.com/office/drawing/2017/model3d" xmlns:o="urn:schemas-microsoft-com:office:office" xmlns:oel="http://schemas.microsoft.com/office/2019/extlst" xmlns:r="http://schemas.openxmlformats.org/officeDocument/2006/relationships" xmlns:m="http://schemas.openxmlformats.org/officeDocument/2006/math" xmlns:v="urn:schemas-microsoft-com:vml" xmlns:wp14="http://schemas.microsoft.com/office/word/2010/wordprocessingDrawing" xmlns:wp="http://schemas.openxmlformats.org/drawingml/2006/wordprocessingDrawing" xmlns:w10="urn:schemas-microsoft-com:office:word" xmlns:w="http://schemas.openxmlformats.org/wordprocessingml/2006/main" xmlns:w14="http://schemas.microsoft.com/office/word/2010/wordml" xmlns:w15="http://schemas.microsoft.com/office/word/2012/wordml" xmlns:w16cex="http://schemas.microsoft.com/office/word/2018/wordml/cex" xmlns:w16cid="http://schemas.microsoft.com/office/word/2016/wordml/cid" xmlns:w16="http://schemas.microsoft.com/office/word/2018/wordml" xmlns:w16du="http://schemas.microsoft.com/office/word/2023/wordml/word16du" xmlns:w16sdtdh="http://schemas.microsoft.com/office/word/2020/wordml/sdtdatahash" xmlns:w16sdtfl="http://schemas.microsoft.com/office/word/2024/wordml/sdtformatlock" xmlns:w16se="http://schemas.microsoft.com/office/word/2015/wordml/symex" xmlns:wpg="http://schemas.microsoft.com/office/word/2010/wordprocessingGroup" xmlns:wpi="http://schemas.microsoft.com/office/word/2010/wordprocessingInk" xmlns:wne="http://schemas.microsoft.com/office/word/2006/wordml" xmlns:wps="http://schemas.microsoft.com/office/word/2010/wordprocessingShape" mc:Ignorable="w14 w15 w16se w16cid w16 w16cex w16sdtdh w16sdtfl w16du wp14">
+  <w:endnote w:type="separator" w:id="-1">
+    <w:p>
+      <w:r>
+        <w:separator/>
+      </w:r>
+    </w:p>
+  </w:endnote>
+  <w:endnote w:type="continuationSeparator" w:id="0">
+    <w:p>
+      <w:r>
+        <w:continuationSeparator/>
+      </w:r>
+    </w:p>
+  </w:endnote>
+</w:endnotes>
+</file>
+
+<file path=word/footer1.xml><?xml version="1.0" encoding="utf-8"?>
+<w:ftr xmlns:wpc="http://schemas.microsoft.com/office/word/2010/wordprocessingCanvas" xmlns:cx="http://schemas.microsoft.com/office/drawing/2014/chartex" xmlns:cx1="http://schemas.microsoft.com/office/drawing/2015/9/8/chartex" xmlns:cx2="http://schemas.microsoft.com/office/drawing/2015/10/21/chartex" xmlns:cx3="http://schemas.microsoft.com/office/drawing/2016/5/9/chartex" xmlns:cx4="http://schemas.microsoft.com/office/drawing/2016/5/10/chartex" xmlns:cx5="http://schemas.microsoft.com/office/drawing/2016/5/11/chartex" xmlns:cx6="http://schemas.microsoft.com/office/drawing/2016/5/12/chartex" xmlns:cx7="http://schemas.microsoft.com/office/drawing/2016/5/13/chartex" xmlns:cx8="http://schemas.microsoft.com/office/drawing/2016/5/14/chartex" xmlns:mc="http://schemas.openxmlformats.org/markup-compatibility/2006" xmlns:aink="http://schemas.microsoft.com/office/drawing/2016/ink" xmlns:am3d="http://schemas.microsoft.com/office/drawing/2017/model3d" xmlns:o="urn:schemas-microsoft-com:office:office" xmlns:oel="http://schemas.microsoft.com/office/2019/extlst" xmlns:r="http://schemas.openxmlformats.org/officeDocument/2006/relationships" xmlns:m="http://schemas.openxmlformats.org/officeDocument/2006/math" xmlns:v="urn:schemas-microsoft-com:vml" xmlns:wp14="http://schemas.microsoft.com/office/word/2010/wordprocessingDrawing" xmlns:wp="http://schemas.openxmlformats.org/drawingml/2006/wordprocessingDrawing" xmlns:w10="urn:schemas-microsoft-com:office:word" xmlns:w="http://schemas.openxmlformats.org/wordprocessingml/2006/main" xmlns:w14="http://schemas.microsoft.com/office/word/2010/wordml" xmlns:w15="http://schemas.microsoft.com/office/word/2012/wordml" xmlns:w16cex="http://schemas.microsoft.com/office/word/2018/wordml/cex" xmlns:w16cid="http://schemas.microsoft.com/office/word/2016/wordml/cid" xmlns:w16="http://schemas.microsoft.com/office/word/2018/wordml" xmlns:w16du="http://schemas.microsoft.com/office/word/2023/wordml/word16du" xmlns:w16sdtdh="http://schemas.microsoft.com/office/word/2020/wordml/sdtdatahash" xmlns:w16sdtfl="http://schemas.microsoft.com/office/word/2024/wordml/sdtformatlock" xmlns:w16se="http://schemas.microsoft.com/office/word/2015/wordml/symex" xmlns:wpg="http://schemas.microsoft.com/office/word/2010/wordprocessingGroup" xmlns:wpi="http://schemas.microsoft.com/office/word/2010/wordprocessingInk" xmlns:wne="http://schemas.microsoft.com/office/word/2006/wordml" xmlns:wps="http://schemas.microsoft.com/office/word/2010/wordprocessingShape" mc:Ignorable="w14 w15 w16se w16cid w16 w16cex w16sdtdh w16sdtfl w16du wp14">
+  <w:sdt>
+    <w:sdtPr>
+      <w:id w:val="1546254720"/>
+      <w:docPartObj>
+        <w:docPartGallery w:val="Page Numbers (Bottom of Page)"/>
+        <w:docPartUnique/>
+      </w:docPartObj>
+    </w:sdtPr>
+    <w:sdtContent>
+      <w:p>
+        <w:pPr>
+          <w:pStyle w:val="llb"/>
+          <w:jc w:val="right"/>
+        </w:pPr>
+        <w:r>
+          <w:fldChar w:fldCharType="begin"/>
+        </w:r>
+        <w:r>
+          <w:instrText>PAGE   \* MERGEFORMAT</w:instrText>
+        </w:r>
+        <w:r>
+          <w:fldChar w:fldCharType="separate"/>
+        </w:r>
+        <w:r>
+          <w:t>2</w:t>
+        </w:r>
+        <w:r>
+          <w:fldChar w:fldCharType="end"/>
+        </w:r>
+      </w:p>
+    </w:sdtContent>
+  </w:sdt>
+  <w:p>
+    <w:pPr>
+      <w:pStyle w:val="llb"/>
+    </w:pPr>
+  </w:p>
+</w:ftr>
+</file>
+
+<file path=word/footnotes.xml><?xml version="1.0" encoding="utf-8"?>
+<w:footnotes xmlns:wpc="http://schemas.microsoft.com/office/word/2010/wordprocessingCanvas" xmlns:cx="http://schemas.microsoft.com/office/drawing/2014/chartex" xmlns:cx1="http://schemas.microsoft.com/office/drawing/2015/9/8/chartex" xmlns:cx2="http://schemas.microsoft.com/office/drawing/2015/10/21/chartex" xmlns:cx3="http://schemas.microsoft.com/office/drawing/2016/5/9/chartex" xmlns:cx4="http://schemas.microsoft.com/office/drawing/2016/5/10/chartex" xmlns:cx5="http://schemas.microsoft.com/office/drawing/2016/5/11/chartex" xmlns:cx6="http://schemas.microsoft.com/office/drawing/2016/5/12/chartex" xmlns:cx7="http://schemas.microsoft.com/office/drawing/2016/5/13/chartex" xmlns:cx8="http://schemas.microsoft.com/office/drawing/2016/5/14/chartex" xmlns:mc="http://schemas.openxmlformats.org/markup-compatibility/2006" xmlns:aink="http://schemas.microsoft.com/office/drawing/2016/ink" xmlns:am3d="http://schemas.microsoft.com/office/drawing/2017/model3d" xmlns:o="urn:schemas-microsoft-com:office:office" xmlns:oel="http://schemas.microsoft.com/office/2019/extlst" xmlns:r="http://schemas.openxmlformats.org/officeDocument/2006/relationships" xmlns:m="http://schemas.openxmlformats.org/officeDocument/2006/math" xmlns:v="urn:schemas-microsoft-com:vml" xmlns:wp14="http://schemas.microsoft.com/office/word/2010/wordprocessingDrawing" xmlns:wp="http://schemas.openxmlformats.org/drawingml/2006/wordprocessingDrawing" xmlns:w10="urn:schemas-microsoft-com:office:word" xmlns:w="http://schemas.openxmlformats.org/wordprocessingml/2006/main" xmlns:w14="http://schemas.microsoft.com/office/word/2010/wordml" xmlns:w15="http://schemas.microsoft.com/office/word/2012/wordml" xmlns:w16cex="http://schemas.microsoft.com/office/word/2018/wordml/cex" xmlns:w16cid="http://schemas.microsoft.com/office/word/2016/wordml/cid" xmlns:w16="http://schemas.microsoft.com/office/word/2018/wordml" xmlns:w16du="http://schemas.microsoft.com/office/word/2023/wordml/word16du" xmlns:w16sdtdh="http://schemas.microsoft.com/office/word/2020/wordml/sdtdatahash" xmlns:w16sdtfl="http://schemas.microsoft.com/office/word/2024/wordml/sdtformatlock" xmlns:w16se="http://schemas.microsoft.com/office/word/2015/wordml/symex" xmlns:wpg="http://schemas.microsoft.com/office/word/2010/wordprocessingGroup" xmlns:wpi="http://schemas.microsoft.com/office/word/2010/wordprocessingInk" xmlns:wne="http://schemas.microsoft.com/office/word/2006/wordml" xmlns:wps="http://schemas.microsoft.com/office/word/2010/wordprocessingShape" mc:Ignorable="w14 w15 w16se w16cid w16 w16cex w16sdtdh w16sdtfl w16du wp14">
+  <w:footnote w:type="separator" w:id="-1">
+    <w:p>
+      <w:r>
+        <w:separator/>
+      </w:r>
+    </w:p>
+  </w:footnote>
+  <w:footnote w:type="continuationSeparator" w:id="0">
+    <w:p>
+      <w:r>
+        <w:continuationSeparator/>
+      </w:r>
+    </w:p>
+  </w:footnote>
+</w:footnotes>
 </file>
 
 <file path=word/numbering.xml><?xml version="1.0" encoding="utf-8"?>
@@ -27445,6 +27536,7 @@
   <w:style w:type="character" w:default="1" w:styleId="Bekezdsalapbettpusa">
     <w:name w:val="Default Paragraph Font"/>
     <w:uiPriority w:val="1"/>
+    <w:semiHidden/>
     <w:unhideWhenUsed/>
   </w:style>
   <w:style w:type="table" w:default="1" w:styleId="Normltblzat">
@@ -27595,6 +27687,48 @@
       <w:b/>
       <w:bCs/>
     </w:rPr>
+  </w:style>
+  <w:style w:type="paragraph" w:styleId="lfej">
+    <w:name w:val="header"/>
+    <w:basedOn w:val="Norml"/>
+    <w:link w:val="lfejChar"/>
+    <w:uiPriority w:val="99"/>
+    <w:unhideWhenUsed/>
+    <w:rsid w:val="004F490E"/>
+    <w:pPr>
+      <w:tabs>
+        <w:tab w:val="center" w:pos="4536"/>
+        <w:tab w:val="right" w:pos="9072"/>
+      </w:tabs>
+    </w:pPr>
+  </w:style>
+  <w:style w:type="character" w:customStyle="1" w:styleId="lfejChar">
+    <w:name w:val="Élőfej Char"/>
+    <w:basedOn w:val="Bekezdsalapbettpusa"/>
+    <w:link w:val="lfej"/>
+    <w:uiPriority w:val="99"/>
+    <w:rsid w:val="004F490E"/>
+  </w:style>
+  <w:style w:type="paragraph" w:styleId="llb">
+    <w:name w:val="footer"/>
+    <w:basedOn w:val="Norml"/>
+    <w:link w:val="llbChar"/>
+    <w:uiPriority w:val="99"/>
+    <w:unhideWhenUsed/>
+    <w:rsid w:val="004F490E"/>
+    <w:pPr>
+      <w:tabs>
+        <w:tab w:val="center" w:pos="4536"/>
+        <w:tab w:val="right" w:pos="9072"/>
+      </w:tabs>
+    </w:pPr>
+  </w:style>
+  <w:style w:type="character" w:customStyle="1" w:styleId="llbChar">
+    <w:name w:val="Élőláb Char"/>
+    <w:basedOn w:val="Bekezdsalapbettpusa"/>
+    <w:link w:val="llb"/>
+    <w:uiPriority w:val="99"/>
+    <w:rsid w:val="004F490E"/>
   </w:style>
 </w:styles>
 </file>

</xml_diff>